<commit_message>
DHCP + ACL + NAT
</commit_message>
<xml_diff>
--- a/day 39/DHCP + ACL + NAT.docx
+++ b/day 39/DHCP + ACL + NAT.docx
@@ -589,6 +589,555 @@
       </w:r>
       <w:r>
         <w:t xml:space="preserve"> Redesign the ACL to target the entire network layer block using wildcard masks (e.g., 192.168.20.0 0.0.0.255) to blanket-protect the network segment regardless of individual host identities.</w:t>
+      </w:r>
+    </w:p>
+    <w:p>
+      <w:r>
+        <w:br/>
+      </w:r>
+      <w:r>
+        <w:br/>
+      </w:r>
+      <w:r>
+        <w:br/>
+      </w:r>
+      <w:r>
+        <w:br/>
+      </w:r>
+      <w:r>
+        <w:br/>
+      </w:r>
+      <w:r>
+        <w:br/>
+      </w:r>
+      <w:r>
+        <w:br/>
+      </w:r>
+      <w:r>
+        <w:br/>
+      </w:r>
+      <w:r>
+        <w:br/>
+      </w:r>
+      <w:r>
+        <w:br/>
+      </w:r>
+      <w:r>
+        <w:br/>
+      </w:r>
+      <w:r>
+        <w:br/>
+      </w:r>
+      <w:r>
+        <w:br/>
+      </w:r>
+      <w:r>
+        <w:br/>
+      </w:r>
+      <w:r>
+        <w:br/>
+      </w:r>
+      <w:r>
+        <w:br/>
+      </w:r>
+      <w:r>
+        <w:br/>
+      </w:r>
+      <w:r>
+        <w:br/>
+      </w:r>
+      <w:r>
+        <w:br/>
+      </w:r>
+      <w:r>
+        <w:br/>
+      </w:r>
+    </w:p>
+    <w:p>
+      <w:pPr>
+        <w:numPr>
+          <w:ilvl w:val="0"/>
+          <w:numId w:val="7"/>
+        </w:numPr>
+        <w:tabs>
+          <w:tab w:val="clear" w:pos="720"/>
+          <w:tab w:val="num" w:pos="360"/>
+        </w:tabs>
+        <w:rPr>
+          <w:b/>
+          <w:bCs/>
+        </w:rPr>
+      </w:pPr>
+      <w:r>
+        <w:rPr>
+          <w:b/>
+          <w:bCs/>
+        </w:rPr>
+        <w:lastRenderedPageBreak/>
+        <w:t>Clash 1: Inbound ACL vs. DHCP (The Bootup Block)</w:t>
+      </w:r>
+    </w:p>
+    <w:p>
+      <w:pPr>
+        <w:numPr>
+          <w:ilvl w:val="0"/>
+          <w:numId w:val="12"/>
+        </w:numPr>
+      </w:pPr>
+      <w:r>
+        <w:rPr>
+          <w:b/>
+          <w:bCs/>
+        </w:rPr>
+        <w:t>How it blocks:</w:t>
+      </w:r>
+      <w:r>
+        <w:t xml:space="preserve"> When you apply an extended Access Control List (ip access-group SECURE_LAN in) to a subinterface, the router enforces a strict security guard at the door. Because every ACL ends with an invisible </w:t>
+      </w:r>
+      <w:r>
+        <w:rPr>
+          <w:b/>
+          <w:bCs/>
+        </w:rPr>
+        <w:t>implicit deny all</w:t>
+      </w:r>
+      <w:r>
+        <w:t xml:space="preserve"> (deny ip any any), the router will instantly drop the PC's initial DHCP request packets before they can ever reach the DHCP engine.</w:t>
+      </w:r>
+    </w:p>
+    <w:p>
+      <w:pPr>
+        <w:numPr>
+          <w:ilvl w:val="0"/>
+          <w:numId w:val="12"/>
+        </w:numPr>
+      </w:pPr>
+      <w:r>
+        <w:rPr>
+          <w:b/>
+          <w:bCs/>
+        </w:rPr>
+        <w:t>The Result:</w:t>
+      </w:r>
+      <w:r>
+        <w:t xml:space="preserve"> The DHCP server is completely blocked from seeing the client. The PC fails to get an IP address and falls back to a broken APIPA address (169.254.x.x).</w:t>
+      </w:r>
+    </w:p>
+    <w:p>
+      <w:pPr>
+        <w:numPr>
+          <w:ilvl w:val="0"/>
+          <w:numId w:val="12"/>
+        </w:numPr>
+      </w:pPr>
+      <w:r>
+        <w:rPr>
+          <w:b/>
+          <w:bCs/>
+        </w:rPr>
+        <w:t>The Resolution:</w:t>
+      </w:r>
+      <w:r>
+        <w:t xml:space="preserve"> You must intentionally open a hole in the security gate </w:t>
+      </w:r>
+      <w:r>
+        <w:rPr>
+          <w:i/>
+          <w:iCs/>
+        </w:rPr>
+        <w:t>before</w:t>
+      </w:r>
+      <w:r>
+        <w:t xml:space="preserve"> the traffic hits the deny rules. This is why we placed lines 5 and 6 at the very top of the ACL:</w:t>
+      </w:r>
+    </w:p>
+    <w:p>
+      <w:r>
+        <w:t>Plaintext</w:t>
+      </w:r>
+    </w:p>
+    <w:p>
+      <w:r>
+        <w:t>5 permit udp any any eq 67  ! Allows DHCP Server requests</w:t>
+      </w:r>
+    </w:p>
+    <w:p>
+      <w:r>
+        <w:t>6 permit udp any any eq 68  ! Allows DHCP Client responses</w:t>
+      </w:r>
+    </w:p>
+    <w:p>
+      <w:pPr>
+        <w:numPr>
+          <w:ilvl w:val="0"/>
+          <w:numId w:val="7"/>
+        </w:numPr>
+        <w:tabs>
+          <w:tab w:val="clear" w:pos="720"/>
+          <w:tab w:val="num" w:pos="360"/>
+        </w:tabs>
+        <w:rPr>
+          <w:b/>
+          <w:bCs/>
+        </w:rPr>
+      </w:pPr>
+      <w:r>
+        <w:rPr>
+          <w:rFonts w:ascii="Segoe UI Emoji" w:hAnsi="Segoe UI Emoji" w:cs="Segoe UI Emoji"/>
+          <w:b/>
+          <w:bCs/>
+        </w:rPr>
+        <w:t>⏱️</w:t>
+      </w:r>
+      <w:r>
+        <w:rPr>
+          <w:b/>
+          <w:bCs/>
+        </w:rPr>
+        <w:t xml:space="preserve"> Clash 2: Cisco Order of Operations (The Directional Block)</w:t>
+      </w:r>
+    </w:p>
+    <w:p>
+      <w:r>
+        <w:t>When a packet travels from your internal network (Inside) out to the internet (Outside), the router follows a hardcoded structural checklist. It does not look at everything at once.</w:t>
+      </w:r>
+    </w:p>
+    <w:p>
+      <w:pPr>
+        <w:numPr>
+          <w:ilvl w:val="0"/>
+          <w:numId w:val="13"/>
+        </w:numPr>
+      </w:pPr>
+      <w:r>
+        <w:rPr>
+          <w:b/>
+          <w:bCs/>
+        </w:rPr>
+        <w:t>How it blocks:</w:t>
+      </w:r>
+      <w:r>
+        <w:t xml:space="preserve"> For traffic coming into a LAN interface, the router processes the </w:t>
+      </w:r>
+      <w:r>
+        <w:rPr>
+          <w:b/>
+          <w:bCs/>
+        </w:rPr>
+        <w:t>Inbound ACL before it processes NAT translation</w:t>
+      </w:r>
+      <w:r>
+        <w:t>.</w:t>
+      </w:r>
+    </w:p>
+    <w:p>
+      <w:pPr>
+        <w:numPr>
+          <w:ilvl w:val="0"/>
+          <w:numId w:val="13"/>
+        </w:numPr>
+      </w:pPr>
+      <w:r>
+        <w:rPr>
+          <w:b/>
+          <w:bCs/>
+        </w:rPr>
+        <w:t>The Mistake:</w:t>
+      </w:r>
+      <w:r>
+        <w:t xml:space="preserve"> If you try to write an inbound ACL on Gi0/0.20 to block a device based on its </w:t>
+      </w:r>
+      <w:r>
+        <w:rPr>
+          <w:i/>
+          <w:iCs/>
+        </w:rPr>
+        <w:t>public</w:t>
+      </w:r>
+      <w:r>
+        <w:t xml:space="preserve"> IP address (203.0.113.1), the ACL will completely fail to block the traffic.</w:t>
+      </w:r>
+    </w:p>
+    <w:p>
+      <w:pPr>
+        <w:numPr>
+          <w:ilvl w:val="0"/>
+          <w:numId w:val="13"/>
+        </w:numPr>
+      </w:pPr>
+      <w:r>
+        <w:rPr>
+          <w:b/>
+          <w:bCs/>
+        </w:rPr>
+        <w:t>Why it blocks your intent:</w:t>
+      </w:r>
+      <w:r>
+        <w:t xml:space="preserve"> When the packet crosses the subinterface, it is still carrying its raw private IP address (192.168.20.2). Because NAT translation hasn't happened yet, the router looks at the ACL, sees no match for the public IP, and </w:t>
+      </w:r>
+      <w:r>
+        <w:lastRenderedPageBreak/>
+        <w:t>lets it through. The order of operations completely blinds your ACL if you use the wrong IP type.</w:t>
+      </w:r>
+    </w:p>
+    <w:p>
+      <w:pPr>
+        <w:numPr>
+          <w:ilvl w:val="0"/>
+          <w:numId w:val="13"/>
+        </w:numPr>
+      </w:pPr>
+      <w:r>
+        <w:rPr>
+          <w:b/>
+          <w:bCs/>
+        </w:rPr>
+        <w:t>The Rule:</w:t>
+      </w:r>
+      <w:r>
+        <w:t xml:space="preserve"> Inbound LAN ACLs must </w:t>
+      </w:r>
+      <w:r>
+        <w:rPr>
+          <w:b/>
+          <w:bCs/>
+        </w:rPr>
+        <w:t>always</w:t>
+      </w:r>
+      <w:r>
+        <w:t xml:space="preserve"> target the raw, untranslated private IP addresses.</w:t>
+      </w:r>
+    </w:p>
+    <w:p>
+      <w:pPr>
+        <w:numPr>
+          <w:ilvl w:val="0"/>
+          <w:numId w:val="7"/>
+        </w:numPr>
+        <w:tabs>
+          <w:tab w:val="clear" w:pos="720"/>
+          <w:tab w:val="num" w:pos="360"/>
+        </w:tabs>
+        <w:rPr>
+          <w:b/>
+          <w:bCs/>
+        </w:rPr>
+      </w:pPr>
+      <w:r>
+        <w:rPr>
+          <w:rFonts w:ascii="Segoe UI Emoji" w:hAnsi="Segoe UI Emoji" w:cs="Segoe UI Emoji"/>
+          <w:b/>
+          <w:bCs/>
+        </w:rPr>
+        <w:t>🧠</w:t>
+      </w:r>
+      <w:r>
+        <w:rPr>
+          <w:b/>
+          <w:bCs/>
+        </w:rPr>
+        <w:t xml:space="preserve"> Clash 3: The Dynamic NAT Cache vs. Running Config (The Memory Block)</w:t>
+      </w:r>
+    </w:p>
+    <w:p>
+      <w:pPr>
+        <w:numPr>
+          <w:ilvl w:val="0"/>
+          <w:numId w:val="14"/>
+        </w:numPr>
+      </w:pPr>
+      <w:r>
+        <w:rPr>
+          <w:b/>
+          <w:bCs/>
+        </w:rPr>
+        <w:t>How it blocks:</w:t>
+      </w:r>
+      <w:r>
+        <w:t xml:space="preserve"> The router handles traffic switching using fast-switching paths in its RAM cache. When you enter a command like no ip nat inside source..., you are changing the configuration blueprint in the </w:t>
+      </w:r>
+      <w:r>
+        <w:rPr>
+          <w:i/>
+          <w:iCs/>
+        </w:rPr>
+        <w:t>Control Plane</w:t>
+      </w:r>
+      <w:r>
+        <w:t xml:space="preserve">. However, the </w:t>
+      </w:r>
+      <w:r>
+        <w:rPr>
+          <w:i/>
+          <w:iCs/>
+        </w:rPr>
+        <w:t>Data Plane</w:t>
+      </w:r>
+      <w:r>
+        <w:t xml:space="preserve"> (the RAM table) keeps holding onto the existing translation blocks to prevent current user sessions from abruptly dropping.</w:t>
+      </w:r>
+    </w:p>
+    <w:p>
+      <w:pPr>
+        <w:numPr>
+          <w:ilvl w:val="0"/>
+          <w:numId w:val="14"/>
+        </w:numPr>
+      </w:pPr>
+      <w:r>
+        <w:rPr>
+          <w:b/>
+          <w:bCs/>
+        </w:rPr>
+        <w:t>The Result:</w:t>
+      </w:r>
+      <w:r>
+        <w:t xml:space="preserve"> The active NAT translation table actively blocks your new configuration commands from taking effect. Even if you successfully add a new public pool block, the router will continue matching packets to the old interface IP (192.168.12.1) because the active session memory takes precedence over the updated config line.</w:t>
+      </w:r>
+    </w:p>
+    <w:p>
+      <w:pPr>
+        <w:numPr>
+          <w:ilvl w:val="0"/>
+          <w:numId w:val="14"/>
+        </w:numPr>
+      </w:pPr>
+      <w:r>
+        <w:rPr>
+          <w:b/>
+          <w:bCs/>
+        </w:rPr>
+        <w:t>The Resolution:</w:t>
+      </w:r>
+      <w:r>
+        <w:t xml:space="preserve"> You must manually break the memory lock by clearing the active cache state using the command: clear ip nat translation *.</w:t>
+      </w:r>
+    </w:p>
+    <w:p>
+      <w:pPr>
+        <w:numPr>
+          <w:ilvl w:val="0"/>
+          <w:numId w:val="7"/>
+        </w:numPr>
+        <w:tabs>
+          <w:tab w:val="clear" w:pos="720"/>
+          <w:tab w:val="num" w:pos="360"/>
+        </w:tabs>
+        <w:rPr>
+          <w:b/>
+          <w:bCs/>
+        </w:rPr>
+      </w:pPr>
+      <w:r>
+        <w:rPr>
+          <w:rFonts w:ascii="Segoe UI Emoji" w:hAnsi="Segoe UI Emoji" w:cs="Segoe UI Emoji"/>
+          <w:b/>
+          <w:bCs/>
+        </w:rPr>
+        <w:t>🔄</w:t>
+      </w:r>
+      <w:r>
+        <w:rPr>
+          <w:b/>
+          <w:bCs/>
+        </w:rPr>
+        <w:t xml:space="preserve"> Clash 4: DHCP Dynamic Allocation vs. Static ACLs (The Drift Block)</w:t>
+      </w:r>
+    </w:p>
+    <w:p>
+      <w:pPr>
+        <w:numPr>
+          <w:ilvl w:val="0"/>
+          <w:numId w:val="15"/>
+        </w:numPr>
+      </w:pPr>
+      <w:r>
+        <w:rPr>
+          <w:b/>
+          <w:bCs/>
+        </w:rPr>
+        <w:t>How it blocks:</w:t>
+      </w:r>
+      <w:r>
+        <w:t xml:space="preserve"> This is a classic logical clash between automation and static rules.</w:t>
+      </w:r>
+    </w:p>
+    <w:p>
+      <w:pPr>
+        <w:numPr>
+          <w:ilvl w:val="0"/>
+          <w:numId w:val="15"/>
+        </w:numPr>
+      </w:pPr>
+      <w:r>
+        <w:rPr>
+          <w:b/>
+          <w:bCs/>
+        </w:rPr>
+        <w:t>The Block:</w:t>
+      </w:r>
+      <w:r>
+        <w:t xml:space="preserve"> A standard Access Control List is completely static—it only knows exactly what you type into it (e.g., host 192.168.20.50). A DHCP pool is entirely dynamic and automated—it hands out IPs sequentially based on lease times and availability.</w:t>
+      </w:r>
+    </w:p>
+    <w:p>
+      <w:pPr>
+        <w:numPr>
+          <w:ilvl w:val="0"/>
+          <w:numId w:val="15"/>
+        </w:numPr>
+      </w:pPr>
+      <w:r>
+        <w:rPr>
+          <w:b/>
+          <w:bCs/>
+        </w:rPr>
+        <w:t>The Loophole:</w:t>
+      </w:r>
+      <w:r>
+        <w:t xml:space="preserve"> If the DHCP server decides to assign the target device the IP address 192.168.20.2 instead of .50, the automation engine has effectively bypassed your security block. The technology doesn't intentionally fight each other, </w:t>
+      </w:r>
+      <w:r>
+        <w:lastRenderedPageBreak/>
+        <w:t>but the dynamic behavior of DHCP completely undermines the structural assumptions of a static host ACL.</w:t>
+      </w:r>
+    </w:p>
+    <w:p>
+      <w:pPr>
+        <w:numPr>
+          <w:ilvl w:val="0"/>
+          <w:numId w:val="15"/>
+        </w:numPr>
+      </w:pPr>
+      <w:r>
+        <w:rPr>
+          <w:b/>
+          <w:bCs/>
+        </w:rPr>
+        <w:t>The Resolution:</w:t>
+      </w:r>
+      <w:r>
+        <w:t xml:space="preserve"> You must force them to cooperate either by locking the automation down via a </w:t>
+      </w:r>
+      <w:r>
+        <w:rPr>
+          <w:b/>
+          <w:bCs/>
+        </w:rPr>
+        <w:t>DHCP Reservation</w:t>
+      </w:r>
+      <w:r>
+        <w:t xml:space="preserve"> (binding the IP directly to the hardware MAC address) or by changing the ACL to block the </w:t>
+      </w:r>
+      <w:r>
+        <w:rPr>
+          <w:b/>
+          <w:bCs/>
+        </w:rPr>
+        <w:t>entire subnet block</w:t>
+      </w:r>
+      <w:r>
+        <w:t xml:space="preserve"> using wildcard masks (192.168.20.0 0.0.0.255).</w:t>
       </w:r>
     </w:p>
     <w:p/>
@@ -605,6 +1154,304 @@
 <file path=word/numbering.xml><?xml version="1.0" encoding="utf-8"?>
 <w:numbering xmlns:wpc="http://schemas.microsoft.com/office/word/2010/wordprocessingCanvas" xmlns:cx="http://schemas.microsoft.com/office/drawing/2014/chartex" xmlns:cx1="http://schemas.microsoft.com/office/drawing/2015/9/8/chartex" xmlns:cx2="http://schemas.microsoft.com/office/drawing/2015/10/21/chartex" xmlns:cx3="http://schemas.microsoft.com/office/drawing/2016/5/9/chartex" xmlns:cx4="http://schemas.microsoft.com/office/drawing/2016/5/10/chartex" xmlns:cx5="http://schemas.microsoft.com/office/drawing/2016/5/11/chartex" xmlns:cx6="http://schemas.microsoft.com/office/drawing/2016/5/12/chartex" xmlns:cx7="http://schemas.microsoft.com/office/drawing/2016/5/13/chartex" xmlns:cx8="http://schemas.microsoft.com/office/drawing/2016/5/14/chartex" xmlns:mc="http://schemas.openxmlformats.org/markup-compatibility/2006" xmlns:aink="http://schemas.microsoft.com/office/drawing/2016/ink" xmlns:am3d="http://schemas.microsoft.com/office/drawing/2017/model3d" xmlns:o="urn:schemas-microsoft-com:office:office" xmlns:oel="http://schemas.microsoft.com/office/2019/extlst" xmlns:r="http://schemas.openxmlformats.org/officeDocument/2006/relationships" xmlns:m="http://schemas.openxmlformats.org/officeDocument/2006/math" xmlns:v="urn:schemas-microsoft-com:vml" xmlns:wp14="http://schemas.microsoft.com/office/word/2010/wordprocessingDrawing" xmlns:wp="http://schemas.openxmlformats.org/drawingml/2006/wordprocessingDrawing" xmlns:w10="urn:schemas-microsoft-com:office:word" xmlns:w="http://schemas.openxmlformats.org/wordprocessingml/2006/main" xmlns:w14="http://schemas.microsoft.com/office/word/2010/wordml" xmlns:w15="http://schemas.microsoft.com/office/word/2012/wordml" xmlns:w16cex="http://schemas.microsoft.com/office/word/2018/wordml/cex" xmlns:w16cid="http://schemas.microsoft.com/office/word/2016/wordml/cid" xmlns:w16="http://schemas.microsoft.com/office/word/2018/wordml" xmlns:w16du="http://schemas.microsoft.com/office/word/2023/wordml/word16du" xmlns:w16sdtdh="http://schemas.microsoft.com/office/word/2020/wordml/sdtdatahash" xmlns:w16sdtfl="http://schemas.microsoft.com/office/word/2024/wordml/sdtformatlock" xmlns:w16se="http://schemas.microsoft.com/office/word/2015/wordml/symex" xmlns:wpg="http://schemas.microsoft.com/office/word/2010/wordprocessingGroup" xmlns:wpi="http://schemas.microsoft.com/office/word/2010/wordprocessingInk" xmlns:wne="http://schemas.microsoft.com/office/word/2006/wordml" xmlns:wps="http://schemas.microsoft.com/office/word/2010/wordprocessingShape" mc:Ignorable="w14 w15 w16se w16cid w16 w16cex w16sdtdh w16sdtfl w16du wp14">
   <w:abstractNum w:abstractNumId="0" w15:restartNumberingAfterBreak="0">
+    <w:nsid w:val="044A4568"/>
+    <w:multiLevelType w:val="multilevel"/>
+    <w:tmpl w:val="E48698BA"/>
+    <w:lvl w:ilvl="0">
+      <w:start w:val="1"/>
+      <w:numFmt w:val="bullet"/>
+      <w:lvlText w:val=""/>
+      <w:lvlJc w:val="left"/>
+      <w:pPr>
+        <w:tabs>
+          <w:tab w:val="num" w:pos="720"/>
+        </w:tabs>
+        <w:ind w:left="720" w:hanging="360"/>
+      </w:pPr>
+      <w:rPr>
+        <w:rFonts w:ascii="Symbol" w:hAnsi="Symbol" w:hint="default"/>
+        <w:sz w:val="20"/>
+      </w:rPr>
+    </w:lvl>
+    <w:lvl w:ilvl="1" w:tentative="1">
+      <w:start w:val="1"/>
+      <w:numFmt w:val="bullet"/>
+      <w:lvlText w:val="o"/>
+      <w:lvlJc w:val="left"/>
+      <w:pPr>
+        <w:tabs>
+          <w:tab w:val="num" w:pos="1440"/>
+        </w:tabs>
+        <w:ind w:left="1440" w:hanging="360"/>
+      </w:pPr>
+      <w:rPr>
+        <w:rFonts w:ascii="Courier New" w:hAnsi="Courier New" w:hint="default"/>
+        <w:sz w:val="20"/>
+      </w:rPr>
+    </w:lvl>
+    <w:lvl w:ilvl="2" w:tentative="1">
+      <w:start w:val="1"/>
+      <w:numFmt w:val="bullet"/>
+      <w:lvlText w:val=""/>
+      <w:lvlJc w:val="left"/>
+      <w:pPr>
+        <w:tabs>
+          <w:tab w:val="num" w:pos="2160"/>
+        </w:tabs>
+        <w:ind w:left="2160" w:hanging="360"/>
+      </w:pPr>
+      <w:rPr>
+        <w:rFonts w:ascii="Wingdings" w:hAnsi="Wingdings" w:hint="default"/>
+        <w:sz w:val="20"/>
+      </w:rPr>
+    </w:lvl>
+    <w:lvl w:ilvl="3" w:tentative="1">
+      <w:start w:val="1"/>
+      <w:numFmt w:val="bullet"/>
+      <w:lvlText w:val=""/>
+      <w:lvlJc w:val="left"/>
+      <w:pPr>
+        <w:tabs>
+          <w:tab w:val="num" w:pos="2880"/>
+        </w:tabs>
+        <w:ind w:left="2880" w:hanging="360"/>
+      </w:pPr>
+      <w:rPr>
+        <w:rFonts w:ascii="Wingdings" w:hAnsi="Wingdings" w:hint="default"/>
+        <w:sz w:val="20"/>
+      </w:rPr>
+    </w:lvl>
+    <w:lvl w:ilvl="4" w:tentative="1">
+      <w:start w:val="1"/>
+      <w:numFmt w:val="bullet"/>
+      <w:lvlText w:val=""/>
+      <w:lvlJc w:val="left"/>
+      <w:pPr>
+        <w:tabs>
+          <w:tab w:val="num" w:pos="3600"/>
+        </w:tabs>
+        <w:ind w:left="3600" w:hanging="360"/>
+      </w:pPr>
+      <w:rPr>
+        <w:rFonts w:ascii="Wingdings" w:hAnsi="Wingdings" w:hint="default"/>
+        <w:sz w:val="20"/>
+      </w:rPr>
+    </w:lvl>
+    <w:lvl w:ilvl="5" w:tentative="1">
+      <w:start w:val="1"/>
+      <w:numFmt w:val="bullet"/>
+      <w:lvlText w:val=""/>
+      <w:lvlJc w:val="left"/>
+      <w:pPr>
+        <w:tabs>
+          <w:tab w:val="num" w:pos="4320"/>
+        </w:tabs>
+        <w:ind w:left="4320" w:hanging="360"/>
+      </w:pPr>
+      <w:rPr>
+        <w:rFonts w:ascii="Wingdings" w:hAnsi="Wingdings" w:hint="default"/>
+        <w:sz w:val="20"/>
+      </w:rPr>
+    </w:lvl>
+    <w:lvl w:ilvl="6" w:tentative="1">
+      <w:start w:val="1"/>
+      <w:numFmt w:val="bullet"/>
+      <w:lvlText w:val=""/>
+      <w:lvlJc w:val="left"/>
+      <w:pPr>
+        <w:tabs>
+          <w:tab w:val="num" w:pos="5040"/>
+        </w:tabs>
+        <w:ind w:left="5040" w:hanging="360"/>
+      </w:pPr>
+      <w:rPr>
+        <w:rFonts w:ascii="Wingdings" w:hAnsi="Wingdings" w:hint="default"/>
+        <w:sz w:val="20"/>
+      </w:rPr>
+    </w:lvl>
+    <w:lvl w:ilvl="7" w:tentative="1">
+      <w:start w:val="1"/>
+      <w:numFmt w:val="bullet"/>
+      <w:lvlText w:val=""/>
+      <w:lvlJc w:val="left"/>
+      <w:pPr>
+        <w:tabs>
+          <w:tab w:val="num" w:pos="5760"/>
+        </w:tabs>
+        <w:ind w:left="5760" w:hanging="360"/>
+      </w:pPr>
+      <w:rPr>
+        <w:rFonts w:ascii="Wingdings" w:hAnsi="Wingdings" w:hint="default"/>
+        <w:sz w:val="20"/>
+      </w:rPr>
+    </w:lvl>
+    <w:lvl w:ilvl="8" w:tentative="1">
+      <w:start w:val="1"/>
+      <w:numFmt w:val="bullet"/>
+      <w:lvlText w:val=""/>
+      <w:lvlJc w:val="left"/>
+      <w:pPr>
+        <w:tabs>
+          <w:tab w:val="num" w:pos="6480"/>
+        </w:tabs>
+        <w:ind w:left="6480" w:hanging="360"/>
+      </w:pPr>
+      <w:rPr>
+        <w:rFonts w:ascii="Wingdings" w:hAnsi="Wingdings" w:hint="default"/>
+        <w:sz w:val="20"/>
+      </w:rPr>
+    </w:lvl>
+  </w:abstractNum>
+  <w:abstractNum w:abstractNumId="1" w15:restartNumberingAfterBreak="0">
+    <w:nsid w:val="0BA91682"/>
+    <w:multiLevelType w:val="multilevel"/>
+    <w:tmpl w:val="61AC92F8"/>
+    <w:lvl w:ilvl="0">
+      <w:start w:val="1"/>
+      <w:numFmt w:val="bullet"/>
+      <w:lvlText w:val=""/>
+      <w:lvlJc w:val="left"/>
+      <w:pPr>
+        <w:tabs>
+          <w:tab w:val="num" w:pos="720"/>
+        </w:tabs>
+        <w:ind w:left="720" w:hanging="360"/>
+      </w:pPr>
+      <w:rPr>
+        <w:rFonts w:ascii="Symbol" w:hAnsi="Symbol" w:hint="default"/>
+        <w:sz w:val="20"/>
+      </w:rPr>
+    </w:lvl>
+    <w:lvl w:ilvl="1" w:tentative="1">
+      <w:start w:val="1"/>
+      <w:numFmt w:val="bullet"/>
+      <w:lvlText w:val="o"/>
+      <w:lvlJc w:val="left"/>
+      <w:pPr>
+        <w:tabs>
+          <w:tab w:val="num" w:pos="1440"/>
+        </w:tabs>
+        <w:ind w:left="1440" w:hanging="360"/>
+      </w:pPr>
+      <w:rPr>
+        <w:rFonts w:ascii="Courier New" w:hAnsi="Courier New" w:hint="default"/>
+        <w:sz w:val="20"/>
+      </w:rPr>
+    </w:lvl>
+    <w:lvl w:ilvl="2" w:tentative="1">
+      <w:start w:val="1"/>
+      <w:numFmt w:val="bullet"/>
+      <w:lvlText w:val=""/>
+      <w:lvlJc w:val="left"/>
+      <w:pPr>
+        <w:tabs>
+          <w:tab w:val="num" w:pos="2160"/>
+        </w:tabs>
+        <w:ind w:left="2160" w:hanging="360"/>
+      </w:pPr>
+      <w:rPr>
+        <w:rFonts w:ascii="Wingdings" w:hAnsi="Wingdings" w:hint="default"/>
+        <w:sz w:val="20"/>
+      </w:rPr>
+    </w:lvl>
+    <w:lvl w:ilvl="3" w:tentative="1">
+      <w:start w:val="1"/>
+      <w:numFmt w:val="bullet"/>
+      <w:lvlText w:val=""/>
+      <w:lvlJc w:val="left"/>
+      <w:pPr>
+        <w:tabs>
+          <w:tab w:val="num" w:pos="2880"/>
+        </w:tabs>
+        <w:ind w:left="2880" w:hanging="360"/>
+      </w:pPr>
+      <w:rPr>
+        <w:rFonts w:ascii="Wingdings" w:hAnsi="Wingdings" w:hint="default"/>
+        <w:sz w:val="20"/>
+      </w:rPr>
+    </w:lvl>
+    <w:lvl w:ilvl="4" w:tentative="1">
+      <w:start w:val="1"/>
+      <w:numFmt w:val="bullet"/>
+      <w:lvlText w:val=""/>
+      <w:lvlJc w:val="left"/>
+      <w:pPr>
+        <w:tabs>
+          <w:tab w:val="num" w:pos="3600"/>
+        </w:tabs>
+        <w:ind w:left="3600" w:hanging="360"/>
+      </w:pPr>
+      <w:rPr>
+        <w:rFonts w:ascii="Wingdings" w:hAnsi="Wingdings" w:hint="default"/>
+        <w:sz w:val="20"/>
+      </w:rPr>
+    </w:lvl>
+    <w:lvl w:ilvl="5" w:tentative="1">
+      <w:start w:val="1"/>
+      <w:numFmt w:val="bullet"/>
+      <w:lvlText w:val=""/>
+      <w:lvlJc w:val="left"/>
+      <w:pPr>
+        <w:tabs>
+          <w:tab w:val="num" w:pos="4320"/>
+        </w:tabs>
+        <w:ind w:left="4320" w:hanging="360"/>
+      </w:pPr>
+      <w:rPr>
+        <w:rFonts w:ascii="Wingdings" w:hAnsi="Wingdings" w:hint="default"/>
+        <w:sz w:val="20"/>
+      </w:rPr>
+    </w:lvl>
+    <w:lvl w:ilvl="6" w:tentative="1">
+      <w:start w:val="1"/>
+      <w:numFmt w:val="bullet"/>
+      <w:lvlText w:val=""/>
+      <w:lvlJc w:val="left"/>
+      <w:pPr>
+        <w:tabs>
+          <w:tab w:val="num" w:pos="5040"/>
+        </w:tabs>
+        <w:ind w:left="5040" w:hanging="360"/>
+      </w:pPr>
+      <w:rPr>
+        <w:rFonts w:ascii="Wingdings" w:hAnsi="Wingdings" w:hint="default"/>
+        <w:sz w:val="20"/>
+      </w:rPr>
+    </w:lvl>
+    <w:lvl w:ilvl="7" w:tentative="1">
+      <w:start w:val="1"/>
+      <w:numFmt w:val="bullet"/>
+      <w:lvlText w:val=""/>
+      <w:lvlJc w:val="left"/>
+      <w:pPr>
+        <w:tabs>
+          <w:tab w:val="num" w:pos="5760"/>
+        </w:tabs>
+        <w:ind w:left="5760" w:hanging="360"/>
+      </w:pPr>
+      <w:rPr>
+        <w:rFonts w:ascii="Wingdings" w:hAnsi="Wingdings" w:hint="default"/>
+        <w:sz w:val="20"/>
+      </w:rPr>
+    </w:lvl>
+    <w:lvl w:ilvl="8" w:tentative="1">
+      <w:start w:val="1"/>
+      <w:numFmt w:val="bullet"/>
+      <w:lvlText w:val=""/>
+      <w:lvlJc w:val="left"/>
+      <w:pPr>
+        <w:tabs>
+          <w:tab w:val="num" w:pos="6480"/>
+        </w:tabs>
+        <w:ind w:left="6480" w:hanging="360"/>
+      </w:pPr>
+      <w:rPr>
+        <w:rFonts w:ascii="Wingdings" w:hAnsi="Wingdings" w:hint="default"/>
+        <w:sz w:val="20"/>
+      </w:rPr>
+    </w:lvl>
+  </w:abstractNum>
+  <w:abstractNum w:abstractNumId="2" w15:restartNumberingAfterBreak="0">
     <w:nsid w:val="29B244C5"/>
     <w:multiLevelType w:val="multilevel"/>
     <w:tmpl w:val="1E227220"/>
@@ -753,7 +1600,305 @@
       </w:rPr>
     </w:lvl>
   </w:abstractNum>
-  <w:abstractNum w:abstractNumId="1" w15:restartNumberingAfterBreak="0">
+  <w:abstractNum w:abstractNumId="3" w15:restartNumberingAfterBreak="0">
+    <w:nsid w:val="2E715DD6"/>
+    <w:multiLevelType w:val="multilevel"/>
+    <w:tmpl w:val="314811D0"/>
+    <w:lvl w:ilvl="0">
+      <w:start w:val="1"/>
+      <w:numFmt w:val="bullet"/>
+      <w:lvlText w:val=""/>
+      <w:lvlJc w:val="left"/>
+      <w:pPr>
+        <w:tabs>
+          <w:tab w:val="num" w:pos="720"/>
+        </w:tabs>
+        <w:ind w:left="720" w:hanging="360"/>
+      </w:pPr>
+      <w:rPr>
+        <w:rFonts w:ascii="Symbol" w:hAnsi="Symbol" w:hint="default"/>
+        <w:sz w:val="20"/>
+      </w:rPr>
+    </w:lvl>
+    <w:lvl w:ilvl="1" w:tentative="1">
+      <w:start w:val="1"/>
+      <w:numFmt w:val="bullet"/>
+      <w:lvlText w:val="o"/>
+      <w:lvlJc w:val="left"/>
+      <w:pPr>
+        <w:tabs>
+          <w:tab w:val="num" w:pos="1440"/>
+        </w:tabs>
+        <w:ind w:left="1440" w:hanging="360"/>
+      </w:pPr>
+      <w:rPr>
+        <w:rFonts w:ascii="Courier New" w:hAnsi="Courier New" w:hint="default"/>
+        <w:sz w:val="20"/>
+      </w:rPr>
+    </w:lvl>
+    <w:lvl w:ilvl="2" w:tentative="1">
+      <w:start w:val="1"/>
+      <w:numFmt w:val="bullet"/>
+      <w:lvlText w:val=""/>
+      <w:lvlJc w:val="left"/>
+      <w:pPr>
+        <w:tabs>
+          <w:tab w:val="num" w:pos="2160"/>
+        </w:tabs>
+        <w:ind w:left="2160" w:hanging="360"/>
+      </w:pPr>
+      <w:rPr>
+        <w:rFonts w:ascii="Wingdings" w:hAnsi="Wingdings" w:hint="default"/>
+        <w:sz w:val="20"/>
+      </w:rPr>
+    </w:lvl>
+    <w:lvl w:ilvl="3" w:tentative="1">
+      <w:start w:val="1"/>
+      <w:numFmt w:val="bullet"/>
+      <w:lvlText w:val=""/>
+      <w:lvlJc w:val="left"/>
+      <w:pPr>
+        <w:tabs>
+          <w:tab w:val="num" w:pos="2880"/>
+        </w:tabs>
+        <w:ind w:left="2880" w:hanging="360"/>
+      </w:pPr>
+      <w:rPr>
+        <w:rFonts w:ascii="Wingdings" w:hAnsi="Wingdings" w:hint="default"/>
+        <w:sz w:val="20"/>
+      </w:rPr>
+    </w:lvl>
+    <w:lvl w:ilvl="4" w:tentative="1">
+      <w:start w:val="1"/>
+      <w:numFmt w:val="bullet"/>
+      <w:lvlText w:val=""/>
+      <w:lvlJc w:val="left"/>
+      <w:pPr>
+        <w:tabs>
+          <w:tab w:val="num" w:pos="3600"/>
+        </w:tabs>
+        <w:ind w:left="3600" w:hanging="360"/>
+      </w:pPr>
+      <w:rPr>
+        <w:rFonts w:ascii="Wingdings" w:hAnsi="Wingdings" w:hint="default"/>
+        <w:sz w:val="20"/>
+      </w:rPr>
+    </w:lvl>
+    <w:lvl w:ilvl="5" w:tentative="1">
+      <w:start w:val="1"/>
+      <w:numFmt w:val="bullet"/>
+      <w:lvlText w:val=""/>
+      <w:lvlJc w:val="left"/>
+      <w:pPr>
+        <w:tabs>
+          <w:tab w:val="num" w:pos="4320"/>
+        </w:tabs>
+        <w:ind w:left="4320" w:hanging="360"/>
+      </w:pPr>
+      <w:rPr>
+        <w:rFonts w:ascii="Wingdings" w:hAnsi="Wingdings" w:hint="default"/>
+        <w:sz w:val="20"/>
+      </w:rPr>
+    </w:lvl>
+    <w:lvl w:ilvl="6" w:tentative="1">
+      <w:start w:val="1"/>
+      <w:numFmt w:val="bullet"/>
+      <w:lvlText w:val=""/>
+      <w:lvlJc w:val="left"/>
+      <w:pPr>
+        <w:tabs>
+          <w:tab w:val="num" w:pos="5040"/>
+        </w:tabs>
+        <w:ind w:left="5040" w:hanging="360"/>
+      </w:pPr>
+      <w:rPr>
+        <w:rFonts w:ascii="Wingdings" w:hAnsi="Wingdings" w:hint="default"/>
+        <w:sz w:val="20"/>
+      </w:rPr>
+    </w:lvl>
+    <w:lvl w:ilvl="7" w:tentative="1">
+      <w:start w:val="1"/>
+      <w:numFmt w:val="bullet"/>
+      <w:lvlText w:val=""/>
+      <w:lvlJc w:val="left"/>
+      <w:pPr>
+        <w:tabs>
+          <w:tab w:val="num" w:pos="5760"/>
+        </w:tabs>
+        <w:ind w:left="5760" w:hanging="360"/>
+      </w:pPr>
+      <w:rPr>
+        <w:rFonts w:ascii="Wingdings" w:hAnsi="Wingdings" w:hint="default"/>
+        <w:sz w:val="20"/>
+      </w:rPr>
+    </w:lvl>
+    <w:lvl w:ilvl="8" w:tentative="1">
+      <w:start w:val="1"/>
+      <w:numFmt w:val="bullet"/>
+      <w:lvlText w:val=""/>
+      <w:lvlJc w:val="left"/>
+      <w:pPr>
+        <w:tabs>
+          <w:tab w:val="num" w:pos="6480"/>
+        </w:tabs>
+        <w:ind w:left="6480" w:hanging="360"/>
+      </w:pPr>
+      <w:rPr>
+        <w:rFonts w:ascii="Wingdings" w:hAnsi="Wingdings" w:hint="default"/>
+        <w:sz w:val="20"/>
+      </w:rPr>
+    </w:lvl>
+  </w:abstractNum>
+  <w:abstractNum w:abstractNumId="4" w15:restartNumberingAfterBreak="0">
+    <w:nsid w:val="2F6619A9"/>
+    <w:multiLevelType w:val="multilevel"/>
+    <w:tmpl w:val="317CDB46"/>
+    <w:lvl w:ilvl="0">
+      <w:start w:val="1"/>
+      <w:numFmt w:val="bullet"/>
+      <w:lvlText w:val=""/>
+      <w:lvlJc w:val="left"/>
+      <w:pPr>
+        <w:tabs>
+          <w:tab w:val="num" w:pos="720"/>
+        </w:tabs>
+        <w:ind w:left="720" w:hanging="360"/>
+      </w:pPr>
+      <w:rPr>
+        <w:rFonts w:ascii="Symbol" w:hAnsi="Symbol" w:hint="default"/>
+        <w:sz w:val="20"/>
+      </w:rPr>
+    </w:lvl>
+    <w:lvl w:ilvl="1" w:tentative="1">
+      <w:start w:val="1"/>
+      <w:numFmt w:val="bullet"/>
+      <w:lvlText w:val="o"/>
+      <w:lvlJc w:val="left"/>
+      <w:pPr>
+        <w:tabs>
+          <w:tab w:val="num" w:pos="1440"/>
+        </w:tabs>
+        <w:ind w:left="1440" w:hanging="360"/>
+      </w:pPr>
+      <w:rPr>
+        <w:rFonts w:ascii="Courier New" w:hAnsi="Courier New" w:hint="default"/>
+        <w:sz w:val="20"/>
+      </w:rPr>
+    </w:lvl>
+    <w:lvl w:ilvl="2" w:tentative="1">
+      <w:start w:val="1"/>
+      <w:numFmt w:val="bullet"/>
+      <w:lvlText w:val=""/>
+      <w:lvlJc w:val="left"/>
+      <w:pPr>
+        <w:tabs>
+          <w:tab w:val="num" w:pos="2160"/>
+        </w:tabs>
+        <w:ind w:left="2160" w:hanging="360"/>
+      </w:pPr>
+      <w:rPr>
+        <w:rFonts w:ascii="Wingdings" w:hAnsi="Wingdings" w:hint="default"/>
+        <w:sz w:val="20"/>
+      </w:rPr>
+    </w:lvl>
+    <w:lvl w:ilvl="3" w:tentative="1">
+      <w:start w:val="1"/>
+      <w:numFmt w:val="bullet"/>
+      <w:lvlText w:val=""/>
+      <w:lvlJc w:val="left"/>
+      <w:pPr>
+        <w:tabs>
+          <w:tab w:val="num" w:pos="2880"/>
+        </w:tabs>
+        <w:ind w:left="2880" w:hanging="360"/>
+      </w:pPr>
+      <w:rPr>
+        <w:rFonts w:ascii="Wingdings" w:hAnsi="Wingdings" w:hint="default"/>
+        <w:sz w:val="20"/>
+      </w:rPr>
+    </w:lvl>
+    <w:lvl w:ilvl="4" w:tentative="1">
+      <w:start w:val="1"/>
+      <w:numFmt w:val="bullet"/>
+      <w:lvlText w:val=""/>
+      <w:lvlJc w:val="left"/>
+      <w:pPr>
+        <w:tabs>
+          <w:tab w:val="num" w:pos="3600"/>
+        </w:tabs>
+        <w:ind w:left="3600" w:hanging="360"/>
+      </w:pPr>
+      <w:rPr>
+        <w:rFonts w:ascii="Wingdings" w:hAnsi="Wingdings" w:hint="default"/>
+        <w:sz w:val="20"/>
+      </w:rPr>
+    </w:lvl>
+    <w:lvl w:ilvl="5" w:tentative="1">
+      <w:start w:val="1"/>
+      <w:numFmt w:val="bullet"/>
+      <w:lvlText w:val=""/>
+      <w:lvlJc w:val="left"/>
+      <w:pPr>
+        <w:tabs>
+          <w:tab w:val="num" w:pos="4320"/>
+        </w:tabs>
+        <w:ind w:left="4320" w:hanging="360"/>
+      </w:pPr>
+      <w:rPr>
+        <w:rFonts w:ascii="Wingdings" w:hAnsi="Wingdings" w:hint="default"/>
+        <w:sz w:val="20"/>
+      </w:rPr>
+    </w:lvl>
+    <w:lvl w:ilvl="6" w:tentative="1">
+      <w:start w:val="1"/>
+      <w:numFmt w:val="bullet"/>
+      <w:lvlText w:val=""/>
+      <w:lvlJc w:val="left"/>
+      <w:pPr>
+        <w:tabs>
+          <w:tab w:val="num" w:pos="5040"/>
+        </w:tabs>
+        <w:ind w:left="5040" w:hanging="360"/>
+      </w:pPr>
+      <w:rPr>
+        <w:rFonts w:ascii="Wingdings" w:hAnsi="Wingdings" w:hint="default"/>
+        <w:sz w:val="20"/>
+      </w:rPr>
+    </w:lvl>
+    <w:lvl w:ilvl="7" w:tentative="1">
+      <w:start w:val="1"/>
+      <w:numFmt w:val="bullet"/>
+      <w:lvlText w:val=""/>
+      <w:lvlJc w:val="left"/>
+      <w:pPr>
+        <w:tabs>
+          <w:tab w:val="num" w:pos="5760"/>
+        </w:tabs>
+        <w:ind w:left="5760" w:hanging="360"/>
+      </w:pPr>
+      <w:rPr>
+        <w:rFonts w:ascii="Wingdings" w:hAnsi="Wingdings" w:hint="default"/>
+        <w:sz w:val="20"/>
+      </w:rPr>
+    </w:lvl>
+    <w:lvl w:ilvl="8" w:tentative="1">
+      <w:start w:val="1"/>
+      <w:numFmt w:val="bullet"/>
+      <w:lvlText w:val=""/>
+      <w:lvlJc w:val="left"/>
+      <w:pPr>
+        <w:tabs>
+          <w:tab w:val="num" w:pos="6480"/>
+        </w:tabs>
+        <w:ind w:left="6480" w:hanging="360"/>
+      </w:pPr>
+      <w:rPr>
+        <w:rFonts w:ascii="Wingdings" w:hAnsi="Wingdings" w:hint="default"/>
+        <w:sz w:val="20"/>
+      </w:rPr>
+    </w:lvl>
+  </w:abstractNum>
+  <w:abstractNum w:abstractNumId="5" w15:restartNumberingAfterBreak="0">
     <w:nsid w:val="42E760D6"/>
     <w:multiLevelType w:val="multilevel"/>
     <w:tmpl w:val="3452B71C"/>
@@ -863,7 +2008,7 @@
       </w:pPr>
     </w:lvl>
   </w:abstractNum>
-  <w:abstractNum w:abstractNumId="2" w15:restartNumberingAfterBreak="0">
+  <w:abstractNum w:abstractNumId="6" w15:restartNumberingAfterBreak="0">
     <w:nsid w:val="435F63CC"/>
     <w:multiLevelType w:val="hybridMultilevel"/>
     <w:tmpl w:val="1188E176"/>
@@ -949,7 +2094,7 @@
       </w:pPr>
     </w:lvl>
   </w:abstractNum>
-  <w:abstractNum w:abstractNumId="3" w15:restartNumberingAfterBreak="0">
+  <w:abstractNum w:abstractNumId="7" w15:restartNumberingAfterBreak="0">
     <w:nsid w:val="4564401D"/>
     <w:multiLevelType w:val="hybridMultilevel"/>
     <w:tmpl w:val="CF56C8C6"/>
@@ -1035,7 +2180,7 @@
       </w:pPr>
     </w:lvl>
   </w:abstractNum>
-  <w:abstractNum w:abstractNumId="4" w15:restartNumberingAfterBreak="0">
+  <w:abstractNum w:abstractNumId="8" w15:restartNumberingAfterBreak="0">
     <w:nsid w:val="53EF3838"/>
     <w:multiLevelType w:val="multilevel"/>
     <w:tmpl w:val="D7F42870"/>
@@ -1184,7 +2329,7 @@
       </w:rPr>
     </w:lvl>
   </w:abstractNum>
-  <w:abstractNum w:abstractNumId="5" w15:restartNumberingAfterBreak="0">
+  <w:abstractNum w:abstractNumId="9" w15:restartNumberingAfterBreak="0">
     <w:nsid w:val="545451B5"/>
     <w:multiLevelType w:val="multilevel"/>
     <w:tmpl w:val="99EEB85A"/>
@@ -1298,7 +2443,7 @@
       </w:pPr>
     </w:lvl>
   </w:abstractNum>
-  <w:abstractNum w:abstractNumId="6" w15:restartNumberingAfterBreak="0">
+  <w:abstractNum w:abstractNumId="10" w15:restartNumberingAfterBreak="0">
     <w:nsid w:val="65C20274"/>
     <w:multiLevelType w:val="multilevel"/>
     <w:tmpl w:val="B6C8A376"/>
@@ -1447,7 +2592,7 @@
       </w:rPr>
     </w:lvl>
   </w:abstractNum>
-  <w:abstractNum w:abstractNumId="7" w15:restartNumberingAfterBreak="0">
+  <w:abstractNum w:abstractNumId="11" w15:restartNumberingAfterBreak="0">
     <w:nsid w:val="671A0EFC"/>
     <w:multiLevelType w:val="multilevel"/>
     <w:tmpl w:val="3064CFFA"/>
@@ -1596,7 +2741,7 @@
       </w:rPr>
     </w:lvl>
   </w:abstractNum>
-  <w:abstractNum w:abstractNumId="8" w15:restartNumberingAfterBreak="0">
+  <w:abstractNum w:abstractNumId="12" w15:restartNumberingAfterBreak="0">
     <w:nsid w:val="70F831D6"/>
     <w:multiLevelType w:val="multilevel"/>
     <w:tmpl w:val="4EC2D042"/>
@@ -1710,7 +2855,7 @@
       </w:pPr>
     </w:lvl>
   </w:abstractNum>
-  <w:abstractNum w:abstractNumId="9" w15:restartNumberingAfterBreak="0">
+  <w:abstractNum w:abstractNumId="13" w15:restartNumberingAfterBreak="0">
     <w:nsid w:val="7AC243A5"/>
     <w:multiLevelType w:val="hybridMultilevel"/>
     <w:tmpl w:val="C4860632"/>
@@ -1797,37 +2942,49 @@
     </w:lvl>
   </w:abstractNum>
   <w:num w:numId="1" w16cid:durableId="1489830421">
+    <w:abstractNumId w:val="6"/>
+  </w:num>
+  <w:num w:numId="2" w16cid:durableId="741834170">
+    <w:abstractNumId w:val="5"/>
+  </w:num>
+  <w:num w:numId="3" w16cid:durableId="416290093">
+    <w:abstractNumId w:val="5"/>
+  </w:num>
+  <w:num w:numId="4" w16cid:durableId="1200627316">
+    <w:abstractNumId w:val="7"/>
+  </w:num>
+  <w:num w:numId="5" w16cid:durableId="6372995">
+    <w:abstractNumId w:val="12"/>
+  </w:num>
+  <w:num w:numId="6" w16cid:durableId="1021780504">
+    <w:abstractNumId w:val="13"/>
+  </w:num>
+  <w:num w:numId="7" w16cid:durableId="2027827646">
+    <w:abstractNumId w:val="9"/>
+  </w:num>
+  <w:num w:numId="8" w16cid:durableId="675571703">
+    <w:abstractNumId w:val="11"/>
+  </w:num>
+  <w:num w:numId="9" w16cid:durableId="1728994852">
     <w:abstractNumId w:val="2"/>
   </w:num>
-  <w:num w:numId="2" w16cid:durableId="741834170">
+  <w:num w:numId="10" w16cid:durableId="1856653699">
+    <w:abstractNumId w:val="8"/>
+  </w:num>
+  <w:num w:numId="11" w16cid:durableId="951396420">
+    <w:abstractNumId w:val="10"/>
+  </w:num>
+  <w:num w:numId="12" w16cid:durableId="1508135437">
+    <w:abstractNumId w:val="4"/>
+  </w:num>
+  <w:num w:numId="13" w16cid:durableId="1518498102">
     <w:abstractNumId w:val="1"/>
   </w:num>
-  <w:num w:numId="3" w16cid:durableId="416290093">
-    <w:abstractNumId w:val="1"/>
-  </w:num>
-  <w:num w:numId="4" w16cid:durableId="1200627316">
-    <w:abstractNumId w:val="3"/>
-  </w:num>
-  <w:num w:numId="5" w16cid:durableId="6372995">
-    <w:abstractNumId w:val="8"/>
-  </w:num>
-  <w:num w:numId="6" w16cid:durableId="1021780504">
-    <w:abstractNumId w:val="9"/>
-  </w:num>
-  <w:num w:numId="7" w16cid:durableId="2027827646">
-    <w:abstractNumId w:val="5"/>
-  </w:num>
-  <w:num w:numId="8" w16cid:durableId="675571703">
-    <w:abstractNumId w:val="7"/>
-  </w:num>
-  <w:num w:numId="9" w16cid:durableId="1728994852">
+  <w:num w:numId="14" w16cid:durableId="1362434987">
     <w:abstractNumId w:val="0"/>
   </w:num>
-  <w:num w:numId="10" w16cid:durableId="1856653699">
-    <w:abstractNumId w:val="4"/>
-  </w:num>
-  <w:num w:numId="11" w16cid:durableId="951396420">
-    <w:abstractNumId w:val="6"/>
+  <w:num w:numId="15" w16cid:durableId="1657764162">
+    <w:abstractNumId w:val="3"/>
   </w:num>
 </w:numbering>
 </file>

</xml_diff>